<commit_message>
Fix individual contract layout: signature placement, font size, list numbering, blank page
- Place executor signature image in its own paragraph so it no longer
  pushes the "Распопов Димитр Иосифович" line out of place
- Fix szCs for "Паспорт годен до" placeholders to match other columns
- Remove stray numbering (4./5.) from empty paragraphs after price table
- Remove unused empty paragraphs causing a blank page before СОГЛАСИЕ
</commit_message>
<xml_diff>
--- a/templates/contract_individual.docx
+++ b/templates/contract_individual.docx
@@ -11737,8 +11737,8 @@
             </w:pPr>
             <w:r>
               <w:rPr>
-                <w:sz w:val="20"/>
-                <w:szCs w:val="20"/>
+                <w:sz w:val="16"/>
+                <w:szCs w:val="16"/>
                 <w:rtl w:val="0"/>
                 <w:lang w:val="ru-RU"/>
               </w:rPr>
@@ -11924,8 +11924,8 @@
             </w:pPr>
             <w:r>
               <w:rPr>
-                <w:sz w:val="20"/>
-                <w:szCs w:val="20"/>
+                <w:sz w:val="16"/>
+                <w:szCs w:val="16"/>
                 <w:rtl w:val="0"/>
                 <w:lang w:val="ru-RU"/>
               </w:rPr>
@@ -14140,20 +14140,12 @@
       <w:pPr>
         <w:pStyle w:val="Основной текст"/>
         <w:widowControl w:val="0"/>
-        <w:numPr>
-          <w:ilvl w:val="0"/>
-          <w:numId w:val="8"/>
-        </w:numPr>
       </w:pPr>
     </w:p>
     <w:p>
       <w:pPr>
         <w:pStyle w:val="Основной текст"/>
         <w:widowControl w:val="0"/>
-        <w:numPr>
-          <w:ilvl w:val="0"/>
-          <w:numId w:val="8"/>
-        </w:numPr>
       </w:pPr>
     </w:p>
     <w:p>
@@ -14585,99 +14577,6 @@
         </w:tc>
       </w:tr>
     </w:tbl>
-    <w:p>
-      <w:pPr>
-        <w:pStyle w:val="Основной текст"/>
-        <w:widowControl w:val="0"/>
-        <w:rPr>
-          <w:b w:val="1"/>
-          <w:bCs w:val="1"/>
-          <w:sz w:val="17"/>
-          <w:szCs w:val="17"/>
-        </w:rPr>
-      </w:pPr>
-    </w:p>
-    <w:p>
-      <w:pPr>
-        <w:pStyle w:val="Основной текст"/>
-        <w:rPr>
-          <w:sz w:val="16"/>
-          <w:szCs w:val="16"/>
-        </w:rPr>
-      </w:pPr>
-    </w:p>
-    <w:p>
-      <w:pPr>
-        <w:pStyle w:val="Основной текст"/>
-        <w:rPr>
-          <w:sz w:val="16"/>
-          <w:szCs w:val="16"/>
-        </w:rPr>
-      </w:pPr>
-    </w:p>
-    <w:p>
-      <w:pPr>
-        <w:pStyle w:val="Основной текст"/>
-        <w:rPr>
-          <w:sz w:val="16"/>
-          <w:szCs w:val="16"/>
-        </w:rPr>
-      </w:pPr>
-    </w:p>
-    <w:p>
-      <w:pPr>
-        <w:pStyle w:val="Основной текст"/>
-        <w:rPr>
-          <w:sz w:val="16"/>
-          <w:szCs w:val="16"/>
-        </w:rPr>
-      </w:pPr>
-    </w:p>
-    <w:p>
-      <w:pPr>
-        <w:pStyle w:val="Основной текст"/>
-        <w:rPr>
-          <w:sz w:val="16"/>
-          <w:szCs w:val="16"/>
-        </w:rPr>
-      </w:pPr>
-    </w:p>
-    <w:p>
-      <w:pPr>
-        <w:pStyle w:val="Основной текст"/>
-        <w:rPr>
-          <w:sz w:val="16"/>
-          <w:szCs w:val="16"/>
-        </w:rPr>
-      </w:pPr>
-    </w:p>
-    <w:p>
-      <w:pPr>
-        <w:pStyle w:val="Основной текст"/>
-        <w:rPr>
-          <w:sz w:val="16"/>
-          <w:szCs w:val="16"/>
-        </w:rPr>
-      </w:pPr>
-    </w:p>
-    <w:p>
-      <w:pPr>
-        <w:pStyle w:val="Основной текст"/>
-        <w:rPr>
-          <w:sz w:val="16"/>
-          <w:szCs w:val="16"/>
-        </w:rPr>
-      </w:pPr>
-    </w:p>
-    <w:p>
-      <w:pPr>
-        <w:pStyle w:val="Основной текст"/>
-        <w:rPr>
-          <w:sz w:val="16"/>
-          <w:szCs w:val="16"/>
-        </w:rPr>
-      </w:pPr>
-    </w:p>
     <w:p>
       <w:pPr>
         <w:pStyle w:val="Основной текст"/>

</xml_diff>

<commit_message>
Reduce tourist row height in Appendix 1 table
The data rows were nearly twice as tall as needed, which pushed the
signature onto a new page when a second tourist was added.
</commit_message>
<xml_diff>
--- a/templates/contract_individual.docx
+++ b/templates/contract_individual.docx
@@ -11559,7 +11559,7 @@
           <w:shd w:val="clear" w:color="auto" w:fill="ced7e7"/>
         </w:tblPrEx>
         <w:trPr>
-          <w:trHeight w:val="662" w:hRule="atLeast"/>
+          <w:trHeight w:val="363" w:hRule="atLeast"/>
         </w:trPr>
         <w:tc>
           <w:tcPr>
@@ -11752,7 +11752,7 @@
           <w:shd w:val="clear" w:color="auto" w:fill="ced7e7"/>
         </w:tblPrEx>
         <w:trPr>
-          <w:trHeight w:val="662" w:hRule="atLeast"/>
+          <w:trHeight w:val="363" w:hRule="atLeast"/>
         </w:trPr>
         <w:tc>
           <w:tcPr>

</xml_diff>